<commit_message>
chore(demos/custom-ui): scrub personal data from sample-review.docx
The bundled sample-review.docx embedded a real human's name and an
internal-looking AD identifier across word/comments.xml,
word/document.xml, word/people.xml, and docProps/core.xml:

  w:author="Caio Pizzol"
  w:initials="CP"
  w15:author="Caio Pizzol"
  w15:userId="S::caio@harbourclients.com::6fd3240b-..."
  dc:creator / cp:lastModifiedBy

Re-zipped with neutral metadata so the public demo doesn't ship
employee identity or internal domain references when a reader opens
the sample in Word:

  w:author="Reviewer"
  w:initials="R"
  w15:author="Reviewer"
  w15:userId="S::reviewer@example.com::00000000-..."
  dc:creator="Reviewer", cp:lastModifiedBy="Reviewer"
</commit_message>
<xml_diff>
--- a/demos/custom-ui/public/sample-review.docx
+++ b/demos/custom-ui/public/sample-review.docx
@@ -158,10 +158,10 @@
     <w:p>
       <w:pPr>
         <w:rPr>
-          <w:ins w:id="2" w:author="Caio Pizzol" w:date="2026-04-22T23:16:00Z" w16du:dateUtc="2026-04-22T21:16:00Z"/>
+          <w:ins w:id="2" w:author="Reviewer" w:date="2026-04-22T23:16:00Z" w16du:dateUtc="2026-04-22T21:16:00Z"/>
         </w:rPr>
       </w:pPr>
-      <w:ins w:id="3" w:author="Caio Pizzol" w:date="2026-04-22T23:16:00Z" w16du:dateUtc="2026-04-22T21:16:00Z">
+      <w:ins w:id="3" w:author="Reviewer" w:date="2026-04-22T23:16:00Z" w16du:dateUtc="2026-04-22T21:16:00Z">
         <w:r>
           <w:t>Please coordinate all such notifications through the M&amp;A Practice Group.</w:t>
         </w:r>
@@ -170,7 +170,7 @@
     <w:p>
       <w:pPr>
         <w:rPr>
-          <w:ins w:id="4" w:author="Caio Pizzol" w:date="2026-04-22T23:16:00Z" w16du:dateUtc="2026-04-22T21:16:00Z"/>
+          <w:ins w:id="4" w:author="Reviewer" w:date="2026-04-22T23:16:00Z" w16du:dateUtc="2026-04-22T21:16:00Z"/>
         </w:rPr>
       </w:pPr>
     </w:p>
@@ -178,11 +178,11 @@
       <w:pPr>
         <w:pStyle w:val="Heading2"/>
         <w:rPr>
-          <w:ins w:id="5" w:author="Caio Pizzol" w:date="2026-04-22T23:16:00Z" w16du:dateUtc="2026-04-22T21:16:00Z"/>
+          <w:ins w:id="5" w:author="Reviewer" w:date="2026-04-22T23:16:00Z" w16du:dateUtc="2026-04-22T21:16:00Z"/>
         </w:rPr>
       </w:pPr>
       <w:commentRangeStart w:id="6"/>
-      <w:ins w:id="7" w:author="Caio Pizzol" w:date="2026-04-22T23:16:00Z" w16du:dateUtc="2026-04-22T21:16:00Z">
+      <w:ins w:id="7" w:author="Reviewer" w:date="2026-04-22T23:16:00Z" w16du:dateUtc="2026-04-22T21:16:00Z">
         <w:r>
           <w:t>Closing Conditions</w:t>
         </w:r>
@@ -200,10 +200,10 @@
     <w:p>
       <w:pPr>
         <w:rPr>
-          <w:ins w:id="8" w:author="Caio Pizzol" w:date="2026-04-22T23:16:00Z" w16du:dateUtc="2026-04-22T21:16:00Z"/>
+          <w:ins w:id="8" w:author="Reviewer" w:date="2026-04-22T23:16:00Z" w16du:dateUtc="2026-04-22T21:16:00Z"/>
         </w:rPr>
       </w:pPr>
-      <w:ins w:id="9" w:author="Caio Pizzol" w:date="2026-04-22T23:16:00Z" w16du:dateUtc="2026-04-22T21:16:00Z">
+      <w:ins w:id="9" w:author="Reviewer" w:date="2026-04-22T23:16:00Z" w16du:dateUtc="2026-04-22T21:16:00Z">
         <w:r>
           <w:t>All customary closing conditions shall be satisfied or waived as set forth in the merger agreement. Please review and respond by Friday.</w:t>
         </w:r>
@@ -222,7 +222,7 @@
 
 <file path=word/comments.xml><?xml version="1.0" encoding="utf-8"?>
 <w:comments xmlns:wpc="http://schemas.microsoft.com/office/word/2010/wordprocessingCanvas" xmlns:cx="http://schemas.microsoft.com/office/drawing/2014/chartex" xmlns:cx1="http://schemas.microsoft.com/office/drawing/2015/9/8/chartex" xmlns:cx2="http://schemas.microsoft.com/office/drawing/2015/10/21/chartex" xmlns:cx3="http://schemas.microsoft.com/office/drawing/2016/5/9/chartex" xmlns:cx4="http://schemas.microsoft.com/office/drawing/2016/5/10/chartex" xmlns:cx5="http://schemas.microsoft.com/office/drawing/2016/5/11/chartex" xmlns:cx6="http://schemas.microsoft.com/office/drawing/2016/5/12/chartex" xmlns:cx7="http://schemas.microsoft.com/office/drawing/2016/5/13/chartex" xmlns:cx8="http://schemas.microsoft.com/office/drawing/2016/5/14/chartex" xmlns:mc="http://schemas.openxmlformats.org/markup-compatibility/2006" xmlns:aink="http://schemas.microsoft.com/office/drawing/2016/ink" xmlns:am3d="http://schemas.microsoft.com/office/drawing/2017/model3d" xmlns:o="urn:schemas-microsoft-com:office:office" xmlns:oel="http://schemas.microsoft.com/office/2019/extlst" xmlns:r="http://schemas.openxmlformats.org/officeDocument/2006/relationships" xmlns:m="http://schemas.openxmlformats.org/officeDocument/2006/math" xmlns:v="urn:schemas-microsoft-com:vml" xmlns:wp14="http://schemas.microsoft.com/office/word/2010/wordprocessingDrawing" xmlns:wp="http://schemas.openxmlformats.org/drawingml/2006/wordprocessingDrawing" xmlns:w10="urn:schemas-microsoft-com:office:word" xmlns:w="http://schemas.openxmlformats.org/wordprocessingml/2006/main" xmlns:w14="http://schemas.microsoft.com/office/word/2010/wordml" xmlns:w15="http://schemas.microsoft.com/office/word/2012/wordml" xmlns:w16cex="http://schemas.microsoft.com/office/word/2018/wordml/cex" xmlns:w16cid="http://schemas.microsoft.com/office/word/2016/wordml/cid" xmlns:w16="http://schemas.microsoft.com/office/word/2018/wordml" xmlns:w16du="http://schemas.microsoft.com/office/word/2023/wordml/word16du" xmlns:w16sdtdh="http://schemas.microsoft.com/office/word/2020/wordml/sdtdatahash" xmlns:w16sdtfl="http://schemas.microsoft.com/office/word/2024/wordml/sdtformatlock" xmlns:w16se="http://schemas.microsoft.com/office/word/2015/wordml/symex" xmlns:wpg="http://schemas.microsoft.com/office/word/2010/wordprocessingGroup" xmlns:wpi="http://schemas.microsoft.com/office/word/2010/wordprocessingInk" xmlns:wne="http://schemas.microsoft.com/office/word/2006/wordml" xmlns:wps="http://schemas.microsoft.com/office/word/2010/wordprocessingShape" mc:Ignorable="w14 w15 w16se w16cid w16 w16cex w16sdtdh w16sdtfl w16du wp14">
-  <w:comment w:id="0" w:author="Caio Pizzol" w:date="2026-04-22T23:16:00Z" w:initials="CP">
+  <w:comment w:id="0" w:author="Reviewer" w:date="2026-04-22T23:16:00Z" w:initials="R">
     <w:p>
       <w:pPr>
         <w:pStyle w:val="CommentText"/>
@@ -238,7 +238,7 @@
       </w:r>
     </w:p>
   </w:comment>
-  <w:comment w:id="1" w:author="Caio Pizzol" w:date="2026-04-22T23:16:00Z" w:initials="CP">
+  <w:comment w:id="1" w:author="Reviewer" w:date="2026-04-22T23:16:00Z" w:initials="R">
     <w:p>
       <w:pPr>
         <w:pStyle w:val="CommentText"/>
@@ -254,7 +254,7 @@
       </w:r>
     </w:p>
   </w:comment>
-  <w:comment w:id="6" w:author="Caio Pizzol" w:date="2026-04-22T23:16:00Z" w:initials="CP">
+  <w:comment w:id="6" w:author="Reviewer" w:date="2026-04-22T23:16:00Z" w:initials="R">
     <w:p>
       <w:pPr>
         <w:pStyle w:val="CommentText"/>
@@ -299,8 +299,8 @@
 
 <file path=word/people.xml><?xml version="1.0" encoding="utf-8"?>
 <w15:people xmlns:wpc="http://schemas.microsoft.com/office/word/2010/wordprocessingCanvas" xmlns:cx="http://schemas.microsoft.com/office/drawing/2014/chartex" xmlns:cx1="http://schemas.microsoft.com/office/drawing/2015/9/8/chartex" xmlns:cx2="http://schemas.microsoft.com/office/drawing/2015/10/21/chartex" xmlns:cx3="http://schemas.microsoft.com/office/drawing/2016/5/9/chartex" xmlns:cx4="http://schemas.microsoft.com/office/drawing/2016/5/10/chartex" xmlns:cx5="http://schemas.microsoft.com/office/drawing/2016/5/11/chartex" xmlns:cx6="http://schemas.microsoft.com/office/drawing/2016/5/12/chartex" xmlns:cx7="http://schemas.microsoft.com/office/drawing/2016/5/13/chartex" xmlns:cx8="http://schemas.microsoft.com/office/drawing/2016/5/14/chartex" xmlns:mc="http://schemas.openxmlformats.org/markup-compatibility/2006" xmlns:aink="http://schemas.microsoft.com/office/drawing/2016/ink" xmlns:am3d="http://schemas.microsoft.com/office/drawing/2017/model3d" xmlns:o="urn:schemas-microsoft-com:office:office" xmlns:oel="http://schemas.microsoft.com/office/2019/extlst" xmlns:r="http://schemas.openxmlformats.org/officeDocument/2006/relationships" xmlns:m="http://schemas.openxmlformats.org/officeDocument/2006/math" xmlns:v="urn:schemas-microsoft-com:vml" xmlns:wp14="http://schemas.microsoft.com/office/word/2010/wordprocessingDrawing" xmlns:wp="http://schemas.openxmlformats.org/drawingml/2006/wordprocessingDrawing" xmlns:w10="urn:schemas-microsoft-com:office:word" xmlns:w="http://schemas.openxmlformats.org/wordprocessingml/2006/main" xmlns:w14="http://schemas.microsoft.com/office/word/2010/wordml" xmlns:w15="http://schemas.microsoft.com/office/word/2012/wordml" xmlns:w16cex="http://schemas.microsoft.com/office/word/2018/wordml/cex" xmlns:w16cid="http://schemas.microsoft.com/office/word/2016/wordml/cid" xmlns:w16="http://schemas.microsoft.com/office/word/2018/wordml" xmlns:w16du="http://schemas.microsoft.com/office/word/2023/wordml/word16du" xmlns:w16sdtdh="http://schemas.microsoft.com/office/word/2020/wordml/sdtdatahash" xmlns:w16sdtfl="http://schemas.microsoft.com/office/word/2024/wordml/sdtformatlock" xmlns:w16se="http://schemas.microsoft.com/office/word/2015/wordml/symex" xmlns:wpg="http://schemas.microsoft.com/office/word/2010/wordprocessingGroup" xmlns:wpi="http://schemas.microsoft.com/office/word/2010/wordprocessingInk" xmlns:wne="http://schemas.microsoft.com/office/word/2006/wordml" xmlns:wps="http://schemas.microsoft.com/office/word/2010/wordprocessingShape" mc:Ignorable="w14 w15 w16se w16cid w16 w16cex w16sdtdh w16sdtfl w16du wp14">
-  <w15:person w15:author="Caio Pizzol">
-    <w15:presenceInfo w15:providerId="AD" w15:userId="S::caio@harbourclients.com::6fd3240b-7a0a-4a58-964d-53a5ec728449"/>
+  <w15:person w15:author="Reviewer">
+    <w15:presenceInfo w15:providerId="AD" w15:userId="S::reviewer@example.com::00000000-0000-0000-0000-000000000000"/>
   </w15:person>
 </w15:people>
 </file>

</xml_diff>